<commit_message>
TD: estimate 100 000 KM, one Prilog II price form per LOT
Investor 12.09.2026: 100 000,00 KM bez PDV-a, LOT 1 30 000,00 KM, LOT 2 70 000,00 KM. The NZ and the Odluka keep the amounts instead of placeholders; the amount in words is corrected to "sto hiljada", the Odluka's 50 000 / 15 000 / 35 000 figures and its 50.000 table total become 100 000 / 30 000 / 70 000, and the "LOT 1a iznos" typo is fixed. rules_joint checks the amounts instead of reporting them pending.

Prilog II is split into one workbook per LOT (LOT n Sjednica, LOT n Hamzići, REKAPITULACIJA LOT n with its own discount, 17 % VAT, notes, date and signature), because the award is per LOT and a bidder may offer one LOT only. The TD JN, the NZ and the Prilog I precedence clause say so; check_boq_recalc verifies both workbooks.
</commit_message>
<xml_diff>
--- a/rfp-hybrid-solar-td/TD-OUTPUT/1. NZ hibridni sistem napajanja BS Sjednica i BS Hamzići.docx
+++ b/rfp-hybrid-solar-td/TD-OUTPUT/1. NZ hibridni sistem napajanja BS Sjednica i BS Hamzići.docx
@@ -474,7 +474,7 @@
           <w:szCs w:val="21"/>
           <w:lang w:val="bs-BA" w:eastAsia="bs-BA"/>
         </w:rPr>
-        <w:t xml:space="preserve">Ponuđač može dostaviti ponudu za jedan ili oba LOT-a. Količine i detaljna tehnička specifikacija su definisane u Tenderskoj Dokumentaciji (TD), Prilog II TD: Obrazac za cijenu ponude i Prilog III TD: Situacije Sjednica, Bileća i Hamzići, Čitluk.</w:t>
+        <w:t xml:space="preserve">Ponuđač može dostaviti ponudu za jedan ili oba LOT-a. Količine i detaljna tehnička specifikacija su definisane u Tenderskoj Dokumentaciji (TD), Prilog II TD: Obrazac za cijenu ponude (zaseban za svaki LOT) i Prilog III TD: Situacije Sjednica, Bileća i Hamzići, Čitluk.</w:t>
       </w:r>
     </w:p>
     <w:p>
@@ -499,7 +499,7 @@
           <w:sz w:val="21"/>
           <w:szCs w:val="21"/>
         </w:rPr>
-        <w:t xml:space="preserve">Procijenjena vrijednost nabavke (bez PDV-a) iznosi ukupno ___.___,__ KM (slovima: ______________ konvertibilnih maraka), i to:</w:t>
+        <w:t xml:space="preserve">Procijenjena vrijednost nabavke (bez PDV-a) iznosi ukupno 100.000,00 KM (sto hiljada konvertibilnih maraka), i to:</w:t>
       </w:r>
     </w:p>
     <w:p>
@@ -524,7 +524,7 @@
           <w:sz w:val="21"/>
           <w:szCs w:val="21"/>
         </w:rPr>
-        <w:t xml:space="preserve">LOT 1 — ___.___,__ KM</w:t>
+        <w:t xml:space="preserve">LOT 1 — 30.000,00 KM</w:t>
       </w:r>
     </w:p>
     <w:p>
@@ -549,7 +549,7 @@
           <w:sz w:val="21"/>
           <w:szCs w:val="21"/>
         </w:rPr>
-        <w:t xml:space="preserve">LOT 2 — ___.___,__ KM</w:t>
+        <w:t xml:space="preserve">LOT 2 — 70.000,00 KM</w:t>
       </w:r>
     </w:p>
     <w:p>

</xml_diff>